<commit_message>
Session 39 - Chapter 3 drafted end to end, 3.6 moved to Discussion, study design verified
</commit_message>
<xml_diff>
--- a/Docs/AR_DPP_Participant_Consent_Form.docx
+++ b/Docs/AR_DPP_Participant_Consent_Form.docx
@@ -262,7 +262,7 @@
         <w:rPr>
           <w:rFonts w:asciiTheme="minorHAnsi" w:hAnsiTheme="minorHAnsi"/>
         </w:rPr>
-        <w:t>Performing guided disassembly tasks on a vehicle control unit under two conditions: a conventional 2D manual (Condition A) and the AR-DPP interface (Condition B). The order is balanced across participants.</w:t>
+        <w:t>Performing guided disassembly tasks on a vehicle control unit under two conditions: a conventional 2D manual (Condition A) and the AR-DPP interface (Condition B).</w:t>
       </w:r>
     </w:p>
     <w:p>
@@ -419,25 +419,11 @@
         </w:rPr>
         <w:t>Your questionnaire answers.</w:t>
       </w:r>
-    </w:p>
-    <w:p>
-      <w:pPr>
-        <w:pStyle w:val="ListParagraph"/>
-        <w:numPr>
-          <w:ilvl w:val="0"/>
-          <w:numId w:val="2"/>
-        </w:numPr>
-        <w:spacing w:after="60"/>
-        <w:jc w:val="both"/>
-        <w:rPr>
-          <w:rFonts w:asciiTheme="minorHAnsi" w:hAnsiTheme="minorHAnsi"/>
-        </w:rPr>
-      </w:pPr>
-      <w:r>
-        <w:rPr>
-          <w:rFonts w:asciiTheme="minorHAnsi" w:hAnsiTheme="minorHAnsi"/>
-        </w:rPr>
-        <w:t>Notes, and – only if you separately agree below – an audio recording of the post-task interview.</w:t>
+      <w:r>
+        <w:rPr>
+          <w:rFonts w:asciiTheme="minorHAnsi" w:hAnsiTheme="minorHAnsi"/>
+        </w:rPr>
+        <w:t>.</w:t>
       </w:r>
     </w:p>
     <w:p>
@@ -452,15 +438,17 @@
         <w:rPr>
           <w:rFonts w:asciiTheme="minorHAnsi" w:hAnsiTheme="minorHAnsi"/>
         </w:rPr>
-        <w:t xml:space="preserve">Your data is handled under the EU General Data Protection Regulation (GDPR). You are identified in the research data only by a participant code (e.g. P01), never by your name. This signed consent form is the only document linking you to that code; it is stored separately and securely from the research data, and is not shared. The anonymised research data may be used in the thesis and related academic publications. Anonymised data cannot be traced back to you and </w:t>
-      </w:r>
-      <w:r>
-        <w:rPr>
-          <w:rFonts w:asciiTheme="minorHAnsi" w:hAnsiTheme="minorHAnsi"/>
-        </w:rPr>
-        <w:lastRenderedPageBreak/>
-        <w:t>therefore cannot be individually withdrawn once anonymised; you may, however, withdraw at any time before anonymisation.</w:t>
-      </w:r>
+        <w:t>Your data is handled under the EU General Data Protection Regulation (GDPR). You are identified in the research data only by a participant code (e.g. P01), never by your name. This signed consent form is the only document linking you to that code; it is stored separately and securely from the research data, and is not shared. The anonymised research data may be used in the thesis and related academic publications. Anonymised data cannot be traced back to you and therefore cannot be individually withdrawn once anonymised; you may, however, withdraw at any time before anonymisation.</w:t>
+      </w:r>
+    </w:p>
+    <w:p>
+      <w:pPr>
+        <w:spacing w:after="120"/>
+        <w:jc w:val="both"/>
+        <w:rPr>
+          <w:rFonts w:asciiTheme="minorHAnsi" w:hAnsiTheme="minorHAnsi"/>
+        </w:rPr>
+      </w:pPr>
     </w:p>
     <w:p>
       <w:pPr>
@@ -479,41 +467,7 @@
           <w:sz w:val="24"/>
           <w:szCs w:val="24"/>
         </w:rPr>
-        <w:t>Audio recording (optional)</w:t>
-      </w:r>
-    </w:p>
-    <w:p>
-      <w:pPr>
-        <w:spacing w:after="120"/>
-        <w:jc w:val="both"/>
-        <w:rPr>
-          <w:rFonts w:asciiTheme="minorHAnsi" w:hAnsiTheme="minorHAnsi"/>
-        </w:rPr>
-      </w:pPr>
-      <w:r>
-        <w:rPr>
-          <w:rFonts w:asciiTheme="minorHAnsi" w:hAnsiTheme="minorHAnsi"/>
-        </w:rPr>
-        <w:t>The post-task interview may be audio recorded only if you give separate consent below. An audio recording of your voice is personal data. If you consent, the recording is used solely to produce an anonymised written transcript, is stored securely and separately, and is permanently deleted within 30 days of transcription. You may take part fully in the study without being recorded – in that case written notes are taken instead.</w:t>
-      </w:r>
-    </w:p>
-    <w:p>
-      <w:pPr>
-        <w:pStyle w:val="Heading2"/>
-        <w:rPr>
-          <w:rFonts w:asciiTheme="minorHAnsi" w:hAnsiTheme="minorHAnsi"/>
-          <w:color w:val="BF4E14" w:themeColor="accent2" w:themeShade="BF"/>
-          <w:sz w:val="24"/>
-          <w:szCs w:val="24"/>
-        </w:rPr>
-      </w:pPr>
-      <w:r>
-        <w:rPr>
-          <w:rFonts w:asciiTheme="minorHAnsi" w:hAnsiTheme="minorHAnsi"/>
-          <w:color w:val="BF4E14" w:themeColor="accent2" w:themeShade="BF"/>
-          <w:sz w:val="24"/>
-          <w:szCs w:val="24"/>
-        </w:rPr>
+        <w:lastRenderedPageBreak/>
         <w:t>Your rights</w:t>
       </w:r>
     </w:p>
@@ -1044,180 +998,6 @@
                 <w:rFonts w:asciiTheme="minorHAnsi" w:hAnsiTheme="minorHAnsi"/>
               </w:rPr>
               <w:t>I understand that my anonymised data may be used in the Master’s thesis and related academic publications.</w:t>
-            </w:r>
-          </w:p>
-        </w:tc>
-      </w:tr>
-    </w:tbl>
-    <w:p>
-      <w:pPr>
-        <w:pStyle w:val="Heading2"/>
-        <w:rPr>
-          <w:rFonts w:asciiTheme="minorHAnsi" w:hAnsiTheme="minorHAnsi"/>
-          <w:color w:val="BF4E14" w:themeColor="accent2" w:themeShade="BF"/>
-          <w:sz w:val="24"/>
-          <w:szCs w:val="24"/>
-        </w:rPr>
-      </w:pPr>
-      <w:r>
-        <w:rPr>
-          <w:rFonts w:asciiTheme="minorHAnsi" w:hAnsiTheme="minorHAnsi"/>
-          <w:color w:val="BF4E14" w:themeColor="accent2" w:themeShade="BF"/>
-          <w:sz w:val="24"/>
-          <w:szCs w:val="24"/>
-        </w:rPr>
-        <w:t>Optional – audio recording</w:t>
-      </w:r>
-    </w:p>
-    <w:tbl>
-      <w:tblPr>
-        <w:tblW w:w="9360" w:type="dxa"/>
-        <w:tblBorders>
-          <w:top w:val="single" w:sz="4" w:space="0" w:color="auto"/>
-          <w:left w:val="single" w:sz="4" w:space="0" w:color="auto"/>
-          <w:bottom w:val="single" w:sz="4" w:space="0" w:color="auto"/>
-          <w:right w:val="single" w:sz="4" w:space="0" w:color="auto"/>
-          <w:insideH w:val="single" w:sz="4" w:space="0" w:color="auto"/>
-          <w:insideV w:val="single" w:sz="4" w:space="0" w:color="auto"/>
-        </w:tblBorders>
-        <w:tblCellMar>
-          <w:left w:w="10" w:type="dxa"/>
-          <w:right w:w="10" w:type="dxa"/>
-        </w:tblCellMar>
-        <w:tblLook w:val="04A0" w:firstRow="1" w:lastRow="0" w:firstColumn="1" w:lastColumn="0" w:noHBand="0" w:noVBand="1"/>
-      </w:tblPr>
-      <w:tblGrid>
-        <w:gridCol w:w="600"/>
-        <w:gridCol w:w="8760"/>
-      </w:tblGrid>
-      <w:tr>
-        <w:tc>
-          <w:tcPr>
-            <w:tcW w:w="600" w:type="dxa"/>
-            <w:tcBorders>
-              <w:top w:val="single" w:sz="1" w:space="0" w:color="CCCCCC"/>
-              <w:left w:val="single" w:sz="1" w:space="0" w:color="CCCCCC"/>
-              <w:bottom w:val="single" w:sz="1" w:space="0" w:color="CCCCCC"/>
-              <w:right w:val="single" w:sz="1" w:space="0" w:color="CCCCCC"/>
-            </w:tcBorders>
-            <w:tcMar>
-              <w:top w:w="80" w:type="dxa"/>
-              <w:left w:w="120" w:type="dxa"/>
-              <w:bottom w:w="80" w:type="dxa"/>
-              <w:right w:w="120" w:type="dxa"/>
-            </w:tcMar>
-            <w:vAlign w:val="center"/>
-          </w:tcPr>
-          <w:p>
-            <w:pPr>
-              <w:jc w:val="center"/>
-              <w:rPr>
-                <w:rFonts w:asciiTheme="minorHAnsi" w:hAnsiTheme="minorHAnsi"/>
-              </w:rPr>
-            </w:pPr>
-            <w:r>
-              <w:rPr>
-                <w:rFonts w:asciiTheme="minorHAnsi" w:hAnsiTheme="minorHAnsi"/>
-                <w:sz w:val="28"/>
-                <w:szCs w:val="28"/>
-              </w:rPr>
-              <w:t>☐</w:t>
-            </w:r>
-          </w:p>
-        </w:tc>
-        <w:tc>
-          <w:tcPr>
-            <w:tcW w:w="8760" w:type="dxa"/>
-            <w:tcBorders>
-              <w:top w:val="single" w:sz="1" w:space="0" w:color="CCCCCC"/>
-              <w:left w:val="single" w:sz="1" w:space="0" w:color="CCCCCC"/>
-              <w:bottom w:val="single" w:sz="1" w:space="0" w:color="CCCCCC"/>
-              <w:right w:val="single" w:sz="1" w:space="0" w:color="CCCCCC"/>
-            </w:tcBorders>
-            <w:tcMar>
-              <w:top w:w="80" w:type="dxa"/>
-              <w:left w:w="120" w:type="dxa"/>
-              <w:bottom w:w="80" w:type="dxa"/>
-              <w:right w:w="120" w:type="dxa"/>
-            </w:tcMar>
-          </w:tcPr>
-          <w:p>
-            <w:pPr>
-              <w:rPr>
-                <w:rFonts w:asciiTheme="minorHAnsi" w:hAnsiTheme="minorHAnsi"/>
-              </w:rPr>
-            </w:pPr>
-            <w:r>
-              <w:rPr>
-                <w:rFonts w:asciiTheme="minorHAnsi" w:hAnsiTheme="minorHAnsi"/>
-              </w:rPr>
-              <w:t>I consent to the post-task interview being AUDIO RECORDED, used only to create an anonymised transcript and deleted within 30 days of transcription.</w:t>
-            </w:r>
-          </w:p>
-        </w:tc>
-      </w:tr>
-      <w:tr>
-        <w:tc>
-          <w:tcPr>
-            <w:tcW w:w="600" w:type="dxa"/>
-            <w:tcBorders>
-              <w:top w:val="single" w:sz="1" w:space="0" w:color="CCCCCC"/>
-              <w:left w:val="single" w:sz="1" w:space="0" w:color="CCCCCC"/>
-              <w:bottom w:val="single" w:sz="1" w:space="0" w:color="CCCCCC"/>
-              <w:right w:val="single" w:sz="1" w:space="0" w:color="CCCCCC"/>
-            </w:tcBorders>
-            <w:tcMar>
-              <w:top w:w="80" w:type="dxa"/>
-              <w:left w:w="120" w:type="dxa"/>
-              <w:bottom w:w="80" w:type="dxa"/>
-              <w:right w:w="120" w:type="dxa"/>
-            </w:tcMar>
-            <w:vAlign w:val="center"/>
-          </w:tcPr>
-          <w:p>
-            <w:pPr>
-              <w:jc w:val="center"/>
-              <w:rPr>
-                <w:rFonts w:asciiTheme="minorHAnsi" w:hAnsiTheme="minorHAnsi"/>
-              </w:rPr>
-            </w:pPr>
-            <w:r>
-              <w:rPr>
-                <w:rFonts w:asciiTheme="minorHAnsi" w:hAnsiTheme="minorHAnsi"/>
-                <w:sz w:val="28"/>
-                <w:szCs w:val="28"/>
-              </w:rPr>
-              <w:t>☐</w:t>
-            </w:r>
-          </w:p>
-        </w:tc>
-        <w:tc>
-          <w:tcPr>
-            <w:tcW w:w="8760" w:type="dxa"/>
-            <w:tcBorders>
-              <w:top w:val="single" w:sz="1" w:space="0" w:color="CCCCCC"/>
-              <w:left w:val="single" w:sz="1" w:space="0" w:color="CCCCCC"/>
-              <w:bottom w:val="single" w:sz="1" w:space="0" w:color="CCCCCC"/>
-              <w:right w:val="single" w:sz="1" w:space="0" w:color="CCCCCC"/>
-            </w:tcBorders>
-            <w:tcMar>
-              <w:top w:w="80" w:type="dxa"/>
-              <w:left w:w="120" w:type="dxa"/>
-              <w:bottom w:w="80" w:type="dxa"/>
-              <w:right w:w="120" w:type="dxa"/>
-            </w:tcMar>
-          </w:tcPr>
-          <w:p>
-            <w:pPr>
-              <w:rPr>
-                <w:rFonts w:asciiTheme="minorHAnsi" w:hAnsiTheme="minorHAnsi"/>
-              </w:rPr>
-            </w:pPr>
-            <w:r>
-              <w:rPr>
-                <w:rFonts w:asciiTheme="minorHAnsi" w:hAnsiTheme="minorHAnsi"/>
-              </w:rPr>
-              <w:t>I do NOT consent to audio recording. Written notes may be taken instead.</w:t>
             </w:r>
           </w:p>
         </w:tc>

</xml_diff>